<commit_message>
feat(autos): align Autos layout with official manual slip format, clean deductibles and coverages
</commit_message>
<xml_diff>
--- a/assets/layouts/Autos.docx
+++ b/assets/layouts/Autos.docx
@@ -558,46 +558,6 @@
           <w:color w:val="002060"/>
         </w:rPr>
       </w:pPr>
-    </w:p>
-    <w:p>
-      <w:pPr>
-        <w:spacing w:after="0" w:line="240" w:lineRule="auto"/>
-        <w:rPr>
-          <w:rFonts w:ascii="Aptos Narrow" w:eastAsia="Times New Roman" w:hAnsi="Aptos Narrow" w:cs="Times New Roman"/>
-          <w:b/>
-          <w:bCs/>
-          <w:color w:val="FFFFFF"/>
-        </w:rPr>
-      </w:pPr>
-      <w:r>
-        <w:rPr>
-          <w:rFonts w:ascii="Aptos Narrow" w:eastAsia="Times New Roman" w:hAnsi="Aptos Narrow" w:cs="Times New Roman"/>
-          <w:b/>
-          <w:bCs/>
-          <w:color w:val="FFFFFF"/>
-        </w:rPr>
-        <w:t>Información General</w:t>
-      </w:r>
-    </w:p>
-    <w:p>
-      <w:pPr>
-        <w:spacing w:after="0" w:line="240" w:lineRule="auto"/>
-        <w:rPr>
-          <w:rFonts w:ascii="Aptos Narrow" w:eastAsia="Times New Roman" w:hAnsi="Aptos Narrow" w:cs="Times New Roman"/>
-          <w:b/>
-          <w:bCs/>
-          <w:color w:val="FFFFFF"/>
-        </w:rPr>
-      </w:pPr>
-      <w:r>
-        <w:rPr>
-          <w:rFonts w:ascii="Aptos Narrow" w:eastAsia="Times New Roman" w:hAnsi="Aptos Narrow" w:cs="Times New Roman"/>
-          <w:b/>
-          <w:bCs/>
-          <w:color w:val="FFFFFF"/>
-        </w:rPr>
-        <w:t>Información General</w:t>
-      </w:r>
     </w:p>
     <w:tbl>
       <w:tblPr>

</xml_diff>